<commit_message>
feat: integrar v3.1 con Cocina Kanban, Recetas, Descuentos, Reportes CSV, Division de Cuenta, RBAC de 4 roles, evidencias de Pytest y documentacion actualizada
</commit_message>
<xml_diff>
--- a/MANUAL_DEL_USUARIO.docx
+++ b/MANUAL_DEL_USUARIO.docx
@@ -10,9 +10,9 @@
         <w:rPr>
           <w:b/>
           <w:color w:val="D4AF37"/>
-          <w:sz w:val="52"/>
+          <w:sz w:val="56"/>
         </w:rPr>
-        <w:t>Manual del Usuario del Producto</w:t>
+        <w:t>MANUAL DEL USUARIO</w:t>
       </w:r>
     </w:p>
     <w:p>
@@ -25,7 +25,7 @@
           <w:color w:val="646464"/>
           <w:sz w:val="32"/>
         </w:rPr>
-        <w:t>Sistema de Gestión de Restaurante: "El Pulpazo"</w:t>
+        <w:t>Sistema de Gestión de Restaurante: "El Pulpazo" (v3.1)</w:t>
       </w:r>
     </w:p>
     <w:p/>
@@ -37,14 +37,196 @@
         <w:rPr>
           <w:b/>
           <w:color w:val="D4AF37"/>
-          <w:sz w:val="36"/>
+          <w:sz w:val="32"/>
         </w:rPr>
-        <w:t>1. Introducción y Bienvenida</w:t>
+        <w:t>1. Portada y Control de Versiones</w:t>
+      </w:r>
+    </w:p>
+    <w:tbl>
+      <w:tblPr>
+        <w:tblStyle w:val="TableGrid"/>
+        <w:tblW w:type="auto" w:w="0"/>
+        <w:jc w:val="center"/>
+        <w:tblLook w:firstColumn="1" w:firstRow="1" w:lastColumn="0" w:lastRow="0" w:noHBand="0" w:noVBand="1" w:val="04A0"/>
+      </w:tblPr>
+      <w:tblGrid>
+        <w:gridCol w:w="4680"/>
+        <w:gridCol w:w="4680"/>
+      </w:tblGrid>
+      <w:tr>
+        <w:tc>
+          <w:tcPr>
+            <w:tcW w:type="dxa" w:w="4680"/>
+            <w:shd w:fill="F4F4F4"/>
+          </w:tcPr>
+          <w:p>
+            <w:r>
+              <w:rPr>
+                <w:b/>
+              </w:rPr>
+              <w:t>Nombre del Sistema:</w:t>
+            </w:r>
+          </w:p>
+        </w:tc>
+        <w:tc>
+          <w:tcPr>
+            <w:tcW w:type="dxa" w:w="4680"/>
+          </w:tcPr>
+          <w:p>
+            <w:r>
+              <w:t>El Pulpazo — Sistema de Gestión de Restaurante y Marisquería</w:t>
+            </w:r>
+          </w:p>
+        </w:tc>
+      </w:tr>
+      <w:tr>
+        <w:tc>
+          <w:tcPr>
+            <w:tcW w:type="dxa" w:w="4680"/>
+            <w:shd w:fill="F4F4F4"/>
+          </w:tcPr>
+          <w:p>
+            <w:r>
+              <w:rPr>
+                <w:b/>
+              </w:rPr>
+              <w:t>Versión del Manual:</w:t>
+            </w:r>
+          </w:p>
+        </w:tc>
+        <w:tc>
+          <w:tcPr>
+            <w:tcW w:type="dxa" w:w="4680"/>
+          </w:tcPr>
+          <w:p>
+            <w:r>
+              <w:t>v3.1 (Versión Mejorada con Cocina, Recetas, Descuentos y Reportes)</w:t>
+            </w:r>
+          </w:p>
+        </w:tc>
+      </w:tr>
+      <w:tr>
+        <w:tc>
+          <w:tcPr>
+            <w:tcW w:type="dxa" w:w="4680"/>
+            <w:shd w:fill="F4F4F4"/>
+          </w:tcPr>
+          <w:p>
+            <w:r>
+              <w:rPr>
+                <w:b/>
+              </w:rPr>
+              <w:t>Fecha de Actualización:</w:t>
+            </w:r>
+          </w:p>
+        </w:tc>
+        <w:tc>
+          <w:tcPr>
+            <w:tcW w:type="dxa" w:w="4680"/>
+          </w:tcPr>
+          <w:p>
+            <w:r>
+              <w:t>23 de Julio de 2026</w:t>
+            </w:r>
+          </w:p>
+        </w:tc>
+      </w:tr>
+      <w:tr>
+        <w:tc>
+          <w:tcPr>
+            <w:tcW w:type="dxa" w:w="4680"/>
+            <w:shd w:fill="F4F4F4"/>
+          </w:tcPr>
+          <w:p>
+            <w:r>
+              <w:rPr>
+                <w:b/>
+              </w:rPr>
+              <w:t>Asignatura:</w:t>
+            </w:r>
+          </w:p>
+        </w:tc>
+        <w:tc>
+          <w:tcPr>
+            <w:tcW w:type="dxa" w:w="4680"/>
+          </w:tcPr>
+          <w:p>
+            <w:r>
+              <w:t>Tópicos de calidad para el desarrollo de software (Actividad 5)</w:t>
+            </w:r>
+          </w:p>
+        </w:tc>
+      </w:tr>
+      <w:tr>
+        <w:tc>
+          <w:tcPr>
+            <w:tcW w:type="dxa" w:w="4680"/>
+            <w:shd w:fill="F4F4F4"/>
+          </w:tcPr>
+          <w:p>
+            <w:r>
+              <w:rPr>
+                <w:b/>
+              </w:rPr>
+              <w:t>Equipo de Desarrollo:</w:t>
+            </w:r>
+          </w:p>
+        </w:tc>
+        <w:tc>
+          <w:tcPr>
+            <w:tcW w:type="dxa" w:w="4680"/>
+          </w:tcPr>
+          <w:p>
+            <w:r>
+              <w:t>Lopez Estrella B. O., Castro Nuñez N. M., Pech Ake S. A., May de los Santos J. J.</w:t>
+            </w:r>
+          </w:p>
+        </w:tc>
+      </w:tr>
+      <w:tr>
+        <w:tc>
+          <w:tcPr>
+            <w:tcW w:type="dxa" w:w="4680"/>
+            <w:shd w:fill="F4F4F4"/>
+          </w:tcPr>
+          <w:p>
+            <w:r>
+              <w:rPr>
+                <w:b/>
+              </w:rPr>
+              <w:t>Público Objetivo:</w:t>
+            </w:r>
+          </w:p>
+        </w:tc>
+        <w:tc>
+          <w:tcPr>
+            <w:tcW w:type="dxa" w:w="4680"/>
+          </w:tcPr>
+          <w:p>
+            <w:r>
+              <w:t>Administradores de restaurante, cajeros, meseros, personal de cocina y operaciones.</w:t>
+            </w:r>
+          </w:p>
+        </w:tc>
+      </w:tr>
+    </w:tbl>
+    <w:p/>
+    <w:p>
+      <w:pPr>
+        <w:pStyle w:val="Heading1"/>
+      </w:pPr>
+      <w:r>
+        <w:rPr>
+          <w:b/>
+          <w:color w:val="D4AF37"/>
+          <w:sz w:val="32"/>
+        </w:rPr>
+        <w:t>2. Introducción y Objetivo</w:t>
       </w:r>
     </w:p>
     <w:p>
       <w:r>
-        <w:t>Bienvenido al Manual del Usuario de El Pulpazo. Este sistema es una plataforma web moderna para la administración integral de marisquerías y restaurantes. Permite controlar en tiempo real la distribución de comedores, la toma de comandas, el cobro con desglose del IVA del 16%, las existencias en inventario y el análisis ejecutivo de ventas.</w:t>
+        <w:t>El Pulpazo v3.1 es una aplicación web integral diseñada para optimizar la operación diaria de restaurantes y marisquerías. Permite administrar en tiempo real el plano de mesas, la toma de comandas, la preparación en cocina estilo Kanban, el cobro con desglose del IVA del 16%, descuentos por cupón, división de cuentas, inventario automático por recetas y analítica ejecutiva. El objetivo de este manual es guiar de forma clara, sencilla y coloquial a cualquier miembro del personal en el uso correcto de la plataforma.</w:t>
       </w:r>
     </w:p>
     <w:p>
@@ -64,14 +246,1372 @@
         <w:rPr>
           <w:b/>
           <w:color w:val="D4AF37"/>
-          <w:sz w:val="36"/>
+          <w:sz w:val="32"/>
         </w:rPr>
-        <w:t>2. Acceso al Sistema y Roles Operativos</w:t>
+        <w:t>3. Índice / Mapa de Contenidos</w:t>
+      </w:r>
+    </w:p>
+    <w:p>
+      <w:pPr>
+        <w:pStyle w:val="ListBullet"/>
+      </w:pPr>
+      <w:r>
+        <w:t>1. Portada y Control de Versiones</w:t>
+      </w:r>
+    </w:p>
+    <w:p>
+      <w:pPr>
+        <w:pStyle w:val="ListBullet"/>
+      </w:pPr>
+      <w:r>
+        <w:t>2. Introducción y Objetivo</w:t>
+      </w:r>
+    </w:p>
+    <w:p>
+      <w:pPr>
+        <w:pStyle w:val="ListBullet"/>
+      </w:pPr>
+      <w:r>
+        <w:t>3. Índice / Mapa de Contenidos</w:t>
+      </w:r>
+    </w:p>
+    <w:p>
+      <w:pPr>
+        <w:pStyle w:val="ListBullet"/>
+      </w:pPr>
+      <w:r>
+        <w:t>4. Requisitos del Sistema</w:t>
+      </w:r>
+    </w:p>
+    <w:p>
+      <w:pPr>
+        <w:pStyle w:val="ListBullet"/>
+      </w:pPr>
+      <w:r>
+        <w:t>5. Convenciones e Iconografía</w:t>
+      </w:r>
+    </w:p>
+    <w:p>
+      <w:pPr>
+        <w:pStyle w:val="ListBullet"/>
+      </w:pPr>
+      <w:r>
+        <w:t>6. Inicio de Sesión</w:t>
+      </w:r>
+    </w:p>
+    <w:p>
+      <w:pPr>
+        <w:pStyle w:val="ListBullet"/>
+      </w:pPr>
+      <w:r>
+        <w:t>7. Descripción General del Sistema</w:t>
+      </w:r>
+    </w:p>
+    <w:p>
+      <w:pPr>
+        <w:pStyle w:val="ListBullet"/>
+      </w:pPr>
+      <w:r>
+        <w:t>8. Roles y Perfiles de Usuario</w:t>
+      </w:r>
+    </w:p>
+    <w:p>
+      <w:pPr>
+        <w:pStyle w:val="ListBullet"/>
+      </w:pPr>
+      <w:r>
+        <w:t>9. Módulos y Operaciones del Usuario</w:t>
+      </w:r>
+    </w:p>
+    <w:p>
+      <w:pPr>
+        <w:pStyle w:val="ListBullet"/>
+      </w:pPr>
+      <w:r>
+        <w:t>10. Validaciones Importantes</w:t>
+      </w:r>
+    </w:p>
+    <w:p>
+      <w:pPr>
+        <w:pStyle w:val="ListBullet"/>
+      </w:pPr>
+      <w:r>
+        <w:t>11. Atajos y Accesos Rápidos</w:t>
+      </w:r>
+    </w:p>
+    <w:p>
+      <w:pPr>
+        <w:pStyle w:val="ListBullet"/>
+      </w:pPr>
+      <w:r>
+        <w:t>12. Solución de Problemas (Troubleshooting)</w:t>
+      </w:r>
+    </w:p>
+    <w:p>
+      <w:pPr>
+        <w:pStyle w:val="ListBullet"/>
+      </w:pPr>
+      <w:r>
+        <w:t>13. Preguntas Frecuentes (FAQ)</w:t>
+      </w:r>
+    </w:p>
+    <w:p>
+      <w:pPr>
+        <w:pStyle w:val="ListBullet"/>
+      </w:pPr>
+      <w:r>
+        <w:t>14. Buenas Prácticas</w:t>
+      </w:r>
+    </w:p>
+    <w:p>
+      <w:pPr>
+        <w:pStyle w:val="ListBullet"/>
+      </w:pPr>
+      <w:r>
+        <w:t>15. Seguridad y Confidencialidad de Datos</w:t>
+      </w:r>
+    </w:p>
+    <w:p>
+      <w:pPr>
+        <w:pStyle w:val="ListBullet"/>
+      </w:pPr>
+      <w:r>
+        <w:t>16. Canal de Soporte y Contacto</w:t>
+      </w:r>
+    </w:p>
+    <w:p>
+      <w:pPr>
+        <w:pStyle w:val="ListBullet"/>
+      </w:pPr>
+      <w:r>
+        <w:t>17. Glosario y Conclusiones</w:t>
+      </w:r>
+    </w:p>
+    <w:p>
+      <w:pPr>
+        <w:pStyle w:val="Heading1"/>
+      </w:pPr>
+      <w:r>
+        <w:rPr>
+          <w:b/>
+          <w:color w:val="D4AF37"/>
+          <w:sz w:val="32"/>
+        </w:rPr>
+        <w:t>4. Requisitos del Sistema</w:t>
+      </w:r>
+    </w:p>
+    <w:tbl>
+      <w:tblPr>
+        <w:tblStyle w:val="TableGrid"/>
+        <w:tblW w:type="auto" w:w="0"/>
+        <w:jc w:val="center"/>
+        <w:tblLook w:firstColumn="1" w:firstRow="1" w:lastColumn="0" w:lastRow="0" w:noHBand="0" w:noVBand="1" w:val="04A0"/>
+      </w:tblPr>
+      <w:tblGrid>
+        <w:gridCol w:w="4680"/>
+        <w:gridCol w:w="4680"/>
+      </w:tblGrid>
+      <w:tr>
+        <w:tc>
+          <w:tcPr>
+            <w:tcW w:type="dxa" w:w="4680"/>
+            <w:shd w:fill="D4AF37"/>
+          </w:tcPr>
+          <w:p>
+            <w:r>
+              <w:rPr>
+                <w:b/>
+              </w:rPr>
+              <w:t>Componente</w:t>
+            </w:r>
+          </w:p>
+        </w:tc>
+        <w:tc>
+          <w:tcPr>
+            <w:tcW w:type="dxa" w:w="4680"/>
+            <w:shd w:fill="D4AF37"/>
+          </w:tcPr>
+          <w:p>
+            <w:r>
+              <w:rPr>
+                <w:b/>
+              </w:rPr>
+              <w:t>Requisito Mínimo Recomendado</w:t>
+            </w:r>
+          </w:p>
+        </w:tc>
+      </w:tr>
+      <w:tr>
+        <w:tc>
+          <w:tcPr>
+            <w:tcW w:type="dxa" w:w="4680"/>
+          </w:tcPr>
+          <w:p>
+            <w:r>
+              <w:t>Navegador Web</w:t>
+            </w:r>
+          </w:p>
+        </w:tc>
+        <w:tc>
+          <w:tcPr>
+            <w:tcW w:type="dxa" w:w="4680"/>
+          </w:tcPr>
+          <w:p>
+            <w:r>
+              <w:t>Google Chrome v100+, Microsoft Edge v100+, Safari v15+ o Mozilla Firefox v100+.</w:t>
+            </w:r>
+          </w:p>
+        </w:tc>
+      </w:tr>
+      <w:tr>
+        <w:tc>
+          <w:tcPr>
+            <w:tcW w:type="dxa" w:w="4680"/>
+          </w:tcPr>
+          <w:p>
+            <w:r>
+              <w:t>Sistema Operativo</w:t>
+            </w:r>
+          </w:p>
+        </w:tc>
+        <w:tc>
+          <w:tcPr>
+            <w:tcW w:type="dxa" w:w="4680"/>
+          </w:tcPr>
+          <w:p>
+            <w:r>
+              <w:t>Windows 10/11, macOS, Linux, Android (Tablet/Celular) o iOS/iPadOS.</w:t>
+            </w:r>
+          </w:p>
+        </w:tc>
+      </w:tr>
+      <w:tr>
+        <w:tc>
+          <w:tcPr>
+            <w:tcW w:type="dxa" w:w="4680"/>
+          </w:tcPr>
+          <w:p>
+            <w:r>
+              <w:t>Conexión a Internet</w:t>
+            </w:r>
+          </w:p>
+        </w:tc>
+        <w:tc>
+          <w:tcPr>
+            <w:tcW w:type="dxa" w:w="4680"/>
+          </w:tcPr>
+          <w:p>
+            <w:r>
+              <w:t>Estable (Mínimo 2 Mbps) para sincronización en la nube con Supabase.</w:t>
+            </w:r>
+          </w:p>
+        </w:tc>
+      </w:tr>
+      <w:tr>
+        <w:tc>
+          <w:tcPr>
+            <w:tcW w:type="dxa" w:w="4680"/>
+          </w:tcPr>
+          <w:p>
+            <w:r>
+              <w:t>Permisos de Cuenta</w:t>
+            </w:r>
+          </w:p>
+        </w:tc>
+        <w:tc>
+          <w:tcPr>
+            <w:tcW w:type="dxa" w:w="4680"/>
+          </w:tcPr>
+          <w:p>
+            <w:r>
+              <w:t>Credenciales de usuario asignadas por el Administrador según su rol.</w:t>
+            </w:r>
+          </w:p>
+        </w:tc>
+      </w:tr>
+    </w:tbl>
+    <w:p/>
+    <w:p>
+      <w:pPr>
+        <w:pStyle w:val="Heading1"/>
+      </w:pPr>
+      <w:r>
+        <w:rPr>
+          <w:b/>
+          <w:color w:val="D4AF37"/>
+          <w:sz w:val="32"/>
+        </w:rPr>
+        <w:t>5. Convenciones e Iconografía</w:t>
       </w:r>
     </w:p>
     <w:p>
       <w:r>
-        <w:t>El sistema cuenta con inicio de sesión por correo y contraseña registrados en la nube (Supabase Auth). Según el puesto del empleado, el sistema adapta sus permisos y opciones del menú:</w:t>
+        <w:t>• ⚠️ Advertencia: Información crítica para prevenir errores operativos o pérdida de datos.</w:t>
+        <w:br/>
+        <w:t>• 💡 Tip / Sugerencia: Consejos útiles para trabajar de forma más rápida y eficiente.</w:t>
+        <w:br/>
+        <w:t>• 🔒 Requiere Permisos: Acción restringida únicamente para usuarios con roles autorizados.</w:t>
+        <w:br/>
+        <w:t>• 🟢 Mesa Libre: Disponible para asignar a clientes en el comedor.</w:t>
+        <w:br/>
+        <w:t>• 🔴 Mesa Ocupada: Comanda activa con tiempo transcurrido.</w:t>
+        <w:br/>
+        <w:t>• 🟠 Mesa Reservada: Apartada para comensales futuros.</w:t>
+        <w:br/>
+        <w:t>• 🔔 Notificación Flotante: Alerta de stock bajo o comanda lista en cocina.</w:t>
+      </w:r>
+    </w:p>
+    <w:p>
+      <w:pPr>
+        <w:pStyle w:val="Heading1"/>
+      </w:pPr>
+      <w:r>
+        <w:rPr>
+          <w:b/>
+          <w:color w:val="D4AF37"/>
+          <w:sz w:val="32"/>
+        </w:rPr>
+        <w:t>6. Inicio de Sesión</w:t>
+      </w:r>
+    </w:p>
+    <w:p>
+      <w:r>
+        <w:t>1. Accede a la URL oficial del sistema: https://santiagopech490-alt.github.io/pescaderia_V3/</w:t>
+        <w:br/>
+        <w:t>2. Ingresa tu correo electrónico registrado y tu contraseña.</w:t>
+        <w:br/>
+        <w:t>3. Haz clic en el botón amarillo 'INICIAR SESIÓN'.</w:t>
+      </w:r>
+    </w:p>
+    <w:p>
+      <w:pPr>
+        <w:jc w:val="center"/>
+      </w:pPr>
+      <w:r>
+        <w:drawing>
+          <wp:inline xmlns:a="http://schemas.openxmlformats.org/drawingml/2006/main" xmlns:pic="http://schemas.openxmlformats.org/drawingml/2006/picture">
+            <wp:extent cx="5303520" cy="2983230"/>
+            <wp:docPr id="1" name="Picture 1"/>
+            <wp:cNvGraphicFramePr>
+              <a:graphicFrameLocks noChangeAspect="1"/>
+            </wp:cNvGraphicFramePr>
+            <a:graphic>
+              <a:graphicData uri="http://schemas.openxmlformats.org/drawingml/2006/picture">
+                <pic:pic>
+                  <pic:nvPicPr>
+                    <pic:cNvPr id="0" name="01_login_autenticacion.png"/>
+                    <pic:cNvPicPr/>
+                  </pic:nvPicPr>
+                  <pic:blipFill>
+                    <a:blip r:embed="rId9"/>
+                    <a:stretch>
+                      <a:fillRect/>
+                    </a:stretch>
+                  </pic:blipFill>
+                  <pic:spPr>
+                    <a:xfrm>
+                      <a:off x="0" y="0"/>
+                      <a:ext cx="5303520" cy="2983230"/>
+                    </a:xfrm>
+                    <a:prstGeom prst="rect"/>
+                  </pic:spPr>
+                </pic:pic>
+              </a:graphicData>
+            </a:graphic>
+          </wp:inline>
+        </w:drawing>
+      </w:r>
+    </w:p>
+    <w:p>
+      <w:pPr>
+        <w:jc w:val="center"/>
+      </w:pPr>
+      <w:r>
+        <w:rPr>
+          <w:i/>
+          <w:color w:val="787878"/>
+          <w:sz w:val="18"/>
+        </w:rPr>
+        <w:t>Figura: Pantalla de Inicio de Sesión de El Pulpazo</w:t>
+      </w:r>
+    </w:p>
+    <w:p>
+      <w:pPr>
+        <w:pStyle w:val="Heading1"/>
+      </w:pPr>
+      <w:r>
+        <w:rPr>
+          <w:b/>
+          <w:color w:val="D4AF37"/>
+          <w:sz w:val="32"/>
+        </w:rPr>
+        <w:t>7. Descripción General del Sistema</w:t>
+      </w:r>
+    </w:p>
+    <w:p>
+      <w:r>
+        <w:t>El sistema cuenta con una interfaz limpia en modo oscuro con acentos dorados (#D4AF37). Su estructura consta de:</w:t>
+        <w:br/>
+        <w:t>1. Barra Lateral (Sidebar): Menú para cambiar entre módulos autorizados.</w:t>
+        <w:br/>
+        <w:t>2. Encabezado (Header): Muestra iniciales, rol (Administrador, Cajera, Mesero, Cocina), campanita de notificaciones, selector Sol/Luna y Cerrar Sesión.</w:t>
+        <w:br/>
+        <w:t>3. Área Central: Visualización interactiva del módulo activo.</w:t>
+      </w:r>
+    </w:p>
+    <w:p>
+      <w:pPr>
+        <w:pStyle w:val="Heading1"/>
+      </w:pPr>
+      <w:r>
+        <w:rPr>
+          <w:b/>
+          <w:color w:val="D4AF37"/>
+          <w:sz w:val="32"/>
+        </w:rPr>
+        <w:t>8. Roles y Perfiles de Usuario</w:t>
+      </w:r>
+    </w:p>
+    <w:tbl>
+      <w:tblPr>
+        <w:tblStyle w:val="TableGrid"/>
+        <w:tblW w:type="auto" w:w="0"/>
+        <w:jc w:val="center"/>
+        <w:tblLook w:firstColumn="1" w:firstRow="1" w:lastColumn="0" w:lastRow="0" w:noHBand="0" w:noVBand="1" w:val="04A0"/>
+      </w:tblPr>
+      <w:tblGrid>
+        <w:gridCol w:w="1872"/>
+        <w:gridCol w:w="1872"/>
+        <w:gridCol w:w="1872"/>
+        <w:gridCol w:w="1872"/>
+        <w:gridCol w:w="1872"/>
+      </w:tblGrid>
+      <w:tr>
+        <w:tc>
+          <w:tcPr>
+            <w:tcW w:type="dxa" w:w="1872"/>
+            <w:shd w:fill="D4AF37"/>
+          </w:tcPr>
+          <w:p>
+            <w:r>
+              <w:rPr>
+                <w:b/>
+              </w:rPr>
+              <w:t>Rol</w:t>
+            </w:r>
+          </w:p>
+        </w:tc>
+        <w:tc>
+          <w:tcPr>
+            <w:tcW w:type="dxa" w:w="1872"/>
+            <w:shd w:fill="D4AF37"/>
+          </w:tcPr>
+          <w:p>
+            <w:r>
+              <w:rPr>
+                <w:b/>
+              </w:rPr>
+              <w:t>Correo de Acceso</w:t>
+            </w:r>
+          </w:p>
+        </w:tc>
+        <w:tc>
+          <w:tcPr>
+            <w:tcW w:type="dxa" w:w="1872"/>
+            <w:shd w:fill="D4AF37"/>
+          </w:tcPr>
+          <w:p>
+            <w:r>
+              <w:rPr>
+                <w:b/>
+              </w:rPr>
+              <w:t>Contraseña</w:t>
+            </w:r>
+          </w:p>
+        </w:tc>
+        <w:tc>
+          <w:tcPr>
+            <w:tcW w:type="dxa" w:w="1872"/>
+            <w:shd w:fill="D4AF37"/>
+          </w:tcPr>
+          <w:p>
+            <w:r>
+              <w:rPr>
+                <w:b/>
+              </w:rPr>
+              <w:t>Vistas Visibles</w:t>
+            </w:r>
+          </w:p>
+        </w:tc>
+        <w:tc>
+          <w:tcPr>
+            <w:tcW w:type="dxa" w:w="1872"/>
+            <w:shd w:fill="D4AF37"/>
+          </w:tcPr>
+          <w:p>
+            <w:r>
+              <w:rPr>
+                <w:b/>
+              </w:rPr>
+              <w:t>Permisos y Capacidades</w:t>
+            </w:r>
+          </w:p>
+        </w:tc>
+      </w:tr>
+      <w:tr>
+        <w:tc>
+          <w:tcPr>
+            <w:tcW w:type="dxa" w:w="1872"/>
+          </w:tcPr>
+          <w:p>
+            <w:r>
+              <w:t>Administrador</w:t>
+            </w:r>
+          </w:p>
+        </w:tc>
+        <w:tc>
+          <w:tcPr>
+            <w:tcW w:type="dxa" w:w="1872"/>
+          </w:tcPr>
+          <w:p>
+            <w:r>
+              <w:t>admin@elpulpazo.com</w:t>
+            </w:r>
+          </w:p>
+        </w:tc>
+        <w:tc>
+          <w:tcPr>
+            <w:tcW w:type="dxa" w:w="1872"/>
+          </w:tcPr>
+          <w:p>
+            <w:r>
+              <w:t>admin@elpulpazo</w:t>
+            </w:r>
+          </w:p>
+        </w:tc>
+        <w:tc>
+          <w:tcPr>
+            <w:tcW w:type="dxa" w:w="1872"/>
+          </w:tcPr>
+          <w:p>
+            <w:r>
+              <w:t>Todas las pantallas</w:t>
+            </w:r>
+          </w:p>
+        </w:tc>
+        <w:tc>
+          <w:tcPr>
+            <w:tcW w:type="dxa" w:w="1872"/>
+          </w:tcPr>
+          <w:p>
+            <w:r>
+              <w:t>Control total: mapa de mesas, platillos, recetas, inventario, reportes CSV y respaldos.</w:t>
+            </w:r>
+          </w:p>
+        </w:tc>
+      </w:tr>
+      <w:tr>
+        <w:tc>
+          <w:tcPr>
+            <w:tcW w:type="dxa" w:w="1872"/>
+          </w:tcPr>
+          <w:p>
+            <w:r>
+              <w:t>Cajera / Cajero</w:t>
+            </w:r>
+          </w:p>
+        </w:tc>
+        <w:tc>
+          <w:tcPr>
+            <w:tcW w:type="dxa" w:w="1872"/>
+          </w:tcPr>
+          <w:p>
+            <w:r>
+              <w:t>Cajero@Pulpazo.com</w:t>
+            </w:r>
+          </w:p>
+        </w:tc>
+        <w:tc>
+          <w:tcPr>
+            <w:tcW w:type="dxa" w:w="1872"/>
+          </w:tcPr>
+          <w:p>
+            <w:r>
+              <w:t>Cajero</w:t>
+            </w:r>
+          </w:p>
+        </w:tc>
+        <w:tc>
+          <w:tcPr>
+            <w:tcW w:type="dxa" w:w="1872"/>
+          </w:tcPr>
+          <w:p>
+            <w:r>
+              <w:t>Mesas, Pedidos, Carrito, Inventario, Corte, Descuentos</w:t>
+            </w:r>
+          </w:p>
+        </w:tc>
+        <w:tc>
+          <w:tcPr>
+            <w:tcW w:type="dxa" w:w="1872"/>
+          </w:tcPr>
+          <w:p>
+            <w:r>
+              <w:t>Procesar cobros, calcular cambio/IVA, emitir tickets digitales, registrar gastos/abonos.</w:t>
+            </w:r>
+          </w:p>
+        </w:tc>
+      </w:tr>
+      <w:tr>
+        <w:tc>
+          <w:tcPr>
+            <w:tcW w:type="dxa" w:w="1872"/>
+          </w:tcPr>
+          <w:p>
+            <w:r>
+              <w:t>Mesero</w:t>
+            </w:r>
+          </w:p>
+        </w:tc>
+        <w:tc>
+          <w:tcPr>
+            <w:tcW w:type="dxa" w:w="1872"/>
+          </w:tcPr>
+          <w:p>
+            <w:r>
+              <w:t>mesero@elpulpazo.com</w:t>
+            </w:r>
+          </w:p>
+        </w:tc>
+        <w:tc>
+          <w:tcPr>
+            <w:tcW w:type="dxa" w:w="1872"/>
+          </w:tcPr>
+          <w:p>
+            <w:r>
+              <w:t>mesero123</w:t>
+            </w:r>
+          </w:p>
+        </w:tc>
+        <w:tc>
+          <w:tcPr>
+            <w:tcW w:type="dxa" w:w="1872"/>
+          </w:tcPr>
+          <w:p>
+            <w:r>
+              <w:t>Mesas, Menú, Carrito, Historial</w:t>
+            </w:r>
+          </w:p>
+        </w:tc>
+        <w:tc>
+          <w:tcPr>
+            <w:tcW w:type="dxa" w:w="1872"/>
+          </w:tcPr>
+          <w:p>
+            <w:r>
+              <w:t>Consultar disponibilidad de mesas, tomar pedidos en el menú digital y enviar al carrito.</w:t>
+            </w:r>
+          </w:p>
+        </w:tc>
+      </w:tr>
+      <w:tr>
+        <w:tc>
+          <w:tcPr>
+            <w:tcW w:type="dxa" w:w="1872"/>
+          </w:tcPr>
+          <w:p>
+            <w:r>
+              <w:t>Cocina</w:t>
+            </w:r>
+          </w:p>
+        </w:tc>
+        <w:tc>
+          <w:tcPr>
+            <w:tcW w:type="dxa" w:w="1872"/>
+          </w:tcPr>
+          <w:p>
+            <w:r>
+              <w:t>cocina@elpulpazo.com</w:t>
+            </w:r>
+          </w:p>
+        </w:tc>
+        <w:tc>
+          <w:tcPr>
+            <w:tcW w:type="dxa" w:w="1872"/>
+          </w:tcPr>
+          <w:p>
+            <w:r>
+              <w:t>cocina123</w:t>
+            </w:r>
+          </w:p>
+        </w:tc>
+        <w:tc>
+          <w:tcPr>
+            <w:tcW w:type="dxa" w:w="1872"/>
+          </w:tcPr>
+          <w:p>
+            <w:r>
+              <w:t>Vista Cocina, Historial</w:t>
+            </w:r>
+          </w:p>
+        </w:tc>
+        <w:tc>
+          <w:tcPr>
+            <w:tcW w:type="dxa" w:w="1872"/>
+          </w:tcPr>
+          <w:p>
+            <w:r>
+              <w:t>Pantalla Kanban de preparación de platillos (Pendiente, En preparación, Listo).</w:t>
+            </w:r>
+          </w:p>
+        </w:tc>
+      </w:tr>
+    </w:tbl>
+    <w:p/>
+    <w:p>
+      <w:pPr>
+        <w:pStyle w:val="Heading1"/>
+      </w:pPr>
+      <w:r>
+        <w:rPr>
+          <w:b/>
+          <w:color w:val="D4AF37"/>
+          <w:sz w:val="32"/>
+        </w:rPr>
+        <w:t>9. Módulos y Operaciones del Usuario</w:t>
+      </w:r>
+    </w:p>
+    <w:p>
+      <w:pPr>
+        <w:pStyle w:val="Heading2"/>
+      </w:pPr>
+      <w:r>
+        <w:rPr>
+          <w:b/>
+          <w:color w:val="282828"/>
+          <w:sz w:val="26"/>
+        </w:rPr>
+        <w:t>9.1 Plano Interactivo de Mesas</w:t>
+      </w:r>
+    </w:p>
+    <w:p>
+      <w:r>
+        <w:t>Permite visualizar la distribución física del salón de comedor en tiempo real.</w:t>
+      </w:r>
+    </w:p>
+    <w:p>
+      <w:pPr>
+        <w:jc w:val="center"/>
+      </w:pPr>
+      <w:r>
+        <w:drawing>
+          <wp:inline xmlns:a="http://schemas.openxmlformats.org/drawingml/2006/main" xmlns:pic="http://schemas.openxmlformats.org/drawingml/2006/picture">
+            <wp:extent cx="5303520" cy="2983230"/>
+            <wp:docPr id="2" name="Picture 2"/>
+            <wp:cNvGraphicFramePr>
+              <a:graphicFrameLocks noChangeAspect="1"/>
+            </wp:cNvGraphicFramePr>
+            <a:graphic>
+              <a:graphicData uri="http://schemas.openxmlformats.org/drawingml/2006/picture">
+                <pic:pic>
+                  <pic:nvPicPr>
+                    <pic:cNvPr id="0" name="02_plano_de_mesas.png"/>
+                    <pic:cNvPicPr/>
+                  </pic:nvPicPr>
+                  <pic:blipFill>
+                    <a:blip r:embed="rId10"/>
+                    <a:stretch>
+                      <a:fillRect/>
+                    </a:stretch>
+                  </pic:blipFill>
+                  <pic:spPr>
+                    <a:xfrm>
+                      <a:off x="0" y="0"/>
+                      <a:ext cx="5303520" cy="2983230"/>
+                    </a:xfrm>
+                    <a:prstGeom prst="rect"/>
+                  </pic:spPr>
+                </pic:pic>
+              </a:graphicData>
+            </a:graphic>
+          </wp:inline>
+        </w:drawing>
+      </w:r>
+    </w:p>
+    <w:p>
+      <w:pPr>
+        <w:jc w:val="center"/>
+      </w:pPr>
+      <w:r>
+        <w:rPr>
+          <w:i/>
+          <w:color w:val="787878"/>
+          <w:sz w:val="18"/>
+        </w:rPr>
+        <w:t>Figura: Plano Interactivo de Mesas</w:t>
+      </w:r>
+    </w:p>
+    <w:p>
+      <w:pPr>
+        <w:pStyle w:val="Heading2"/>
+      </w:pPr>
+      <w:r>
+        <w:rPr>
+          <w:b/>
+          <w:color w:val="282828"/>
+          <w:sz w:val="26"/>
+        </w:rPr>
+        <w:t>9.2 Menú Digital y Tomar Pedido</w:t>
+      </w:r>
+    </w:p>
+    <w:p>
+      <w:r>
+        <w:t>Navegación por categorías de alimentos (Entradas, Platos Fuertes, Bebidas, Postres).</w:t>
+      </w:r>
+    </w:p>
+    <w:p>
+      <w:pPr>
+        <w:jc w:val="center"/>
+      </w:pPr>
+      <w:r>
+        <w:drawing>
+          <wp:inline xmlns:a="http://schemas.openxmlformats.org/drawingml/2006/main" xmlns:pic="http://schemas.openxmlformats.org/drawingml/2006/picture">
+            <wp:extent cx="5303520" cy="2983230"/>
+            <wp:docPr id="3" name="Picture 3"/>
+            <wp:cNvGraphicFramePr>
+              <a:graphicFrameLocks noChangeAspect="1"/>
+            </wp:cNvGraphicFramePr>
+            <a:graphic>
+              <a:graphicData uri="http://schemas.openxmlformats.org/drawingml/2006/picture">
+                <pic:pic>
+                  <pic:nvPicPr>
+                    <pic:cNvPr id="0" name="03_menu_platillos.png"/>
+                    <pic:cNvPicPr/>
+                  </pic:nvPicPr>
+                  <pic:blipFill>
+                    <a:blip r:embed="rId11"/>
+                    <a:stretch>
+                      <a:fillRect/>
+                    </a:stretch>
+                  </pic:blipFill>
+                  <pic:spPr>
+                    <a:xfrm>
+                      <a:off x="0" y="0"/>
+                      <a:ext cx="5303520" cy="2983230"/>
+                    </a:xfrm>
+                    <a:prstGeom prst="rect"/>
+                  </pic:spPr>
+                </pic:pic>
+              </a:graphicData>
+            </a:graphic>
+          </wp:inline>
+        </w:drawing>
+      </w:r>
+    </w:p>
+    <w:p>
+      <w:pPr>
+        <w:jc w:val="center"/>
+      </w:pPr>
+      <w:r>
+        <w:rPr>
+          <w:i/>
+          <w:color w:val="787878"/>
+          <w:sz w:val="18"/>
+        </w:rPr>
+        <w:t>Figura: Menú Digital de Platillos</w:t>
+      </w:r>
+    </w:p>
+    <w:p>
+      <w:pPr>
+        <w:pStyle w:val="Heading2"/>
+      </w:pPr>
+      <w:r>
+        <w:rPr>
+          <w:b/>
+          <w:color w:val="282828"/>
+          <w:sz w:val="26"/>
+        </w:rPr>
+        <w:t>9.3 Carrito, Cobros, IVA y División de Cuenta</w:t>
+      </w:r>
+    </w:p>
+    <w:p>
+      <w:r>
+        <w:t>Selección de mesa, método de pago, cupones, desglose del IVA 16% e importe total.</w:t>
+      </w:r>
+    </w:p>
+    <w:p>
+      <w:pPr>
+        <w:jc w:val="center"/>
+      </w:pPr>
+      <w:r>
+        <w:drawing>
+          <wp:inline xmlns:a="http://schemas.openxmlformats.org/drawingml/2006/main" xmlns:pic="http://schemas.openxmlformats.org/drawingml/2006/picture">
+            <wp:extent cx="5303520" cy="2983230"/>
+            <wp:docPr id="4" name="Picture 4"/>
+            <wp:cNvGraphicFramePr>
+              <a:graphicFrameLocks noChangeAspect="1"/>
+            </wp:cNvGraphicFramePr>
+            <a:graphic>
+              <a:graphicData uri="http://schemas.openxmlformats.org/drawingml/2006/picture">
+                <pic:pic>
+                  <pic:nvPicPr>
+                    <pic:cNvPr id="0" name="04_carrito_checkout.png"/>
+                    <pic:cNvPicPr/>
+                  </pic:nvPicPr>
+                  <pic:blipFill>
+                    <a:blip r:embed="rId12"/>
+                    <a:stretch>
+                      <a:fillRect/>
+                    </a:stretch>
+                  </pic:blipFill>
+                  <pic:spPr>
+                    <a:xfrm>
+                      <a:off x="0" y="0"/>
+                      <a:ext cx="5303520" cy="2983230"/>
+                    </a:xfrm>
+                    <a:prstGeom prst="rect"/>
+                  </pic:spPr>
+                </pic:pic>
+              </a:graphicData>
+            </a:graphic>
+          </wp:inline>
+        </w:drawing>
+      </w:r>
+    </w:p>
+    <w:p>
+      <w:pPr>
+        <w:jc w:val="center"/>
+      </w:pPr>
+      <w:r>
+        <w:rPr>
+          <w:i/>
+          <w:color w:val="787878"/>
+          <w:sz w:val="18"/>
+        </w:rPr>
+        <w:t>Figura: Carrito de Compras y Cobro</w:t>
+      </w:r>
+    </w:p>
+    <w:p>
+      <w:pPr>
+        <w:pStyle w:val="Heading2"/>
+      </w:pPr>
+      <w:r>
+        <w:rPr>
+          <w:b/>
+          <w:color w:val="282828"/>
+          <w:sz w:val="26"/>
+        </w:rPr>
+        <w:t>9.4 Vista de Cocina Kanban (NUEVO v3.1)</w:t>
+      </w:r>
+    </w:p>
+    <w:p>
+      <w:r>
+        <w:t>Organizada en 3 columnas: Pendiente, En preparación y Listo.</w:t>
+      </w:r>
+    </w:p>
+    <w:p>
+      <w:pPr>
+        <w:jc w:val="center"/>
+      </w:pPr>
+      <w:r>
+        <w:drawing>
+          <wp:inline xmlns:a="http://schemas.openxmlformats.org/drawingml/2006/main" xmlns:pic="http://schemas.openxmlformats.org/drawingml/2006/picture">
+            <wp:extent cx="5303520" cy="2983230"/>
+            <wp:docPr id="5" name="Picture 5"/>
+            <wp:cNvGraphicFramePr>
+              <a:graphicFrameLocks noChangeAspect="1"/>
+            </wp:cNvGraphicFramePr>
+            <a:graphic>
+              <a:graphicData uri="http://schemas.openxmlformats.org/drawingml/2006/picture">
+                <pic:pic>
+                  <pic:nvPicPr>
+                    <pic:cNvPr id="0" name="09_vista_cocina_kanban.png"/>
+                    <pic:cNvPicPr/>
+                  </pic:nvPicPr>
+                  <pic:blipFill>
+                    <a:blip r:embed="rId13"/>
+                    <a:stretch>
+                      <a:fillRect/>
+                    </a:stretch>
+                  </pic:blipFill>
+                  <pic:spPr>
+                    <a:xfrm>
+                      <a:off x="0" y="0"/>
+                      <a:ext cx="5303520" cy="2983230"/>
+                    </a:xfrm>
+                    <a:prstGeom prst="rect"/>
+                  </pic:spPr>
+                </pic:pic>
+              </a:graphicData>
+            </a:graphic>
+          </wp:inline>
+        </w:drawing>
+      </w:r>
+    </w:p>
+    <w:p>
+      <w:pPr>
+        <w:jc w:val="center"/>
+      </w:pPr>
+      <w:r>
+        <w:rPr>
+          <w:i/>
+          <w:color w:val="787878"/>
+          <w:sz w:val="18"/>
+        </w:rPr>
+        <w:t>Figura: Vista de Cocina Kanban</w:t>
+      </w:r>
+    </w:p>
+    <w:p>
+      <w:pPr>
+        <w:pStyle w:val="Heading2"/>
+      </w:pPr>
+      <w:r>
+        <w:rPr>
+          <w:b/>
+          <w:color w:val="282828"/>
+          <w:sz w:val="26"/>
+        </w:rPr>
+        <w:t>9.5 Control de Inventario Automático y Recetas</w:t>
+      </w:r>
+    </w:p>
+    <w:p>
+      <w:r>
+        <w:t>Descuento automático de ingredientes por receta al confirmar ventas.</w:t>
+      </w:r>
+    </w:p>
+    <w:p>
+      <w:pPr>
+        <w:jc w:val="center"/>
+      </w:pPr>
+      <w:r>
+        <w:drawing>
+          <wp:inline xmlns:a="http://schemas.openxmlformats.org/drawingml/2006/main" xmlns:pic="http://schemas.openxmlformats.org/drawingml/2006/picture">
+            <wp:extent cx="5303520" cy="2983230"/>
+            <wp:docPr id="6" name="Picture 6"/>
+            <wp:cNvGraphicFramePr>
+              <a:graphicFrameLocks noChangeAspect="1"/>
+            </wp:cNvGraphicFramePr>
+            <a:graphic>
+              <a:graphicData uri="http://schemas.openxmlformats.org/drawingml/2006/picture">
+                <pic:pic>
+                  <pic:nvPicPr>
+                    <pic:cNvPr id="0" name="05_inventario_stock.png"/>
+                    <pic:cNvPicPr/>
+                  </pic:nvPicPr>
+                  <pic:blipFill>
+                    <a:blip r:embed="rId14"/>
+                    <a:stretch>
+                      <a:fillRect/>
+                    </a:stretch>
+                  </pic:blipFill>
+                  <pic:spPr>
+                    <a:xfrm>
+                      <a:off x="0" y="0"/>
+                      <a:ext cx="5303520" cy="2983230"/>
+                    </a:xfrm>
+                    <a:prstGeom prst="rect"/>
+                  </pic:spPr>
+                </pic:pic>
+              </a:graphicData>
+            </a:graphic>
+          </wp:inline>
+        </w:drawing>
+      </w:r>
+    </w:p>
+    <w:p>
+      <w:pPr>
+        <w:jc w:val="center"/>
+      </w:pPr>
+      <w:r>
+        <w:rPr>
+          <w:i/>
+          <w:color w:val="787878"/>
+          <w:sz w:val="18"/>
+        </w:rPr>
+        <w:t>Figura: Control de Inventario</w:t>
+      </w:r>
+    </w:p>
+    <w:p>
+      <w:pPr>
+        <w:pStyle w:val="Heading2"/>
+      </w:pPr>
+      <w:r>
+        <w:rPr>
+          <w:b/>
+          <w:color w:val="282828"/>
+          <w:sz w:val="26"/>
+        </w:rPr>
+        <w:t>9.6 Cupones y Descuentos (NUEVO v3.1)</w:t>
+      </w:r>
+    </w:p>
+    <w:p>
+      <w:r>
+        <w:t>Gestión de cupones de descuento (% o monto fijo).</w:t>
+      </w:r>
+    </w:p>
+    <w:p>
+      <w:pPr>
+        <w:jc w:val="center"/>
+      </w:pPr>
+      <w:r>
+        <w:drawing>
+          <wp:inline xmlns:a="http://schemas.openxmlformats.org/drawingml/2006/main" xmlns:pic="http://schemas.openxmlformats.org/drawingml/2006/picture">
+            <wp:extent cx="5303520" cy="2983230"/>
+            <wp:docPr id="7" name="Picture 7"/>
+            <wp:cNvGraphicFramePr>
+              <a:graphicFrameLocks noChangeAspect="1"/>
+            </wp:cNvGraphicFramePr>
+            <a:graphic>
+              <a:graphicData uri="http://schemas.openxmlformats.org/drawingml/2006/picture">
+                <pic:pic>
+                  <pic:nvPicPr>
+                    <pic:cNvPr id="0" name="11_cupones_descuentos.png"/>
+                    <pic:cNvPicPr/>
+                  </pic:nvPicPr>
+                  <pic:blipFill>
+                    <a:blip r:embed="rId15"/>
+                    <a:stretch>
+                      <a:fillRect/>
+                    </a:stretch>
+                  </pic:blipFill>
+                  <pic:spPr>
+                    <a:xfrm>
+                      <a:off x="0" y="0"/>
+                      <a:ext cx="5303520" cy="2983230"/>
+                    </a:xfrm>
+                    <a:prstGeom prst="rect"/>
+                  </pic:spPr>
+                </pic:pic>
+              </a:graphicData>
+            </a:graphic>
+          </wp:inline>
+        </w:drawing>
+      </w:r>
+    </w:p>
+    <w:p>
+      <w:pPr>
+        <w:jc w:val="center"/>
+      </w:pPr>
+      <w:r>
+        <w:rPr>
+          <w:i/>
+          <w:color w:val="787878"/>
+          <w:sz w:val="18"/>
+        </w:rPr>
+        <w:t>Figura: Cupones y Descuentos</w:t>
+      </w:r>
+    </w:p>
+    <w:p>
+      <w:pPr>
+        <w:pStyle w:val="Heading2"/>
+      </w:pPr>
+      <w:r>
+        <w:rPr>
+          <w:b/>
+          <w:color w:val="282828"/>
+          <w:sz w:val="26"/>
+        </w:rPr>
+        <w:t>9.7 Reportes de Ventas y Exportación CSV (NUEVO v3.1)</w:t>
+      </w:r>
+    </w:p>
+    <w:p>
+      <w:r>
+        <w:t>Analítica avanzada con exportación a Excel / CSV.</w:t>
+      </w:r>
+    </w:p>
+    <w:p>
+      <w:pPr>
+        <w:jc w:val="center"/>
+      </w:pPr>
+      <w:r>
+        <w:drawing>
+          <wp:inline xmlns:a="http://schemas.openxmlformats.org/drawingml/2006/main" xmlns:pic="http://schemas.openxmlformats.org/drawingml/2006/picture">
+            <wp:extent cx="5303520" cy="2983230"/>
+            <wp:docPr id="8" name="Picture 8"/>
+            <wp:cNvGraphicFramePr>
+              <a:graphicFrameLocks noChangeAspect="1"/>
+            </wp:cNvGraphicFramePr>
+            <a:graphic>
+              <a:graphicData uri="http://schemas.openxmlformats.org/drawingml/2006/picture">
+                <pic:pic>
+                  <pic:nvPicPr>
+                    <pic:cNvPr id="0" name="10_reportes_ventas.png"/>
+                    <pic:cNvPicPr/>
+                  </pic:nvPicPr>
+                  <pic:blipFill>
+                    <a:blip r:embed="rId16"/>
+                    <a:stretch>
+                      <a:fillRect/>
+                    </a:stretch>
+                  </pic:blipFill>
+                  <pic:spPr>
+                    <a:xfrm>
+                      <a:off x="0" y="0"/>
+                      <a:ext cx="5303520" cy="2983230"/>
+                    </a:xfrm>
+                    <a:prstGeom prst="rect"/>
+                  </pic:spPr>
+                </pic:pic>
+              </a:graphicData>
+            </a:graphic>
+          </wp:inline>
+        </w:drawing>
+      </w:r>
+    </w:p>
+    <w:p>
+      <w:pPr>
+        <w:jc w:val="center"/>
+      </w:pPr>
+      <w:r>
+        <w:rPr>
+          <w:i/>
+          <w:color w:val="787878"/>
+          <w:sz w:val="18"/>
+        </w:rPr>
+        <w:t>Figura: Reportes de Ventas</w:t>
+      </w:r>
+    </w:p>
+    <w:p>
+      <w:pPr>
+        <w:pStyle w:val="Heading2"/>
+      </w:pPr>
+      <w:r>
+        <w:rPr>
+          <w:b/>
+          <w:color w:val="282828"/>
+          <w:sz w:val="26"/>
+        </w:rPr>
+        <w:t>9.8 Dashboard Ejecutivo</w:t>
+      </w:r>
+    </w:p>
+    <w:p>
+      <w:pPr>
+        <w:jc w:val="center"/>
+      </w:pPr>
+      <w:r>
+        <w:drawing>
+          <wp:inline xmlns:a="http://schemas.openxmlformats.org/drawingml/2006/main" xmlns:pic="http://schemas.openxmlformats.org/drawingml/2006/picture">
+            <wp:extent cx="5303520" cy="2983230"/>
+            <wp:docPr id="9" name="Picture 9"/>
+            <wp:cNvGraphicFramePr>
+              <a:graphicFrameLocks noChangeAspect="1"/>
+            </wp:cNvGraphicFramePr>
+            <a:graphic>
+              <a:graphicData uri="http://schemas.openxmlformats.org/drawingml/2006/picture">
+                <pic:pic>
+                  <pic:nvPicPr>
+                    <pic:cNvPr id="0" name="06_dashboard_ejecutivo.png"/>
+                    <pic:cNvPicPr/>
+                  </pic:nvPicPr>
+                  <pic:blipFill>
+                    <a:blip r:embed="rId17"/>
+                    <a:stretch>
+                      <a:fillRect/>
+                    </a:stretch>
+                  </pic:blipFill>
+                  <pic:spPr>
+                    <a:xfrm>
+                      <a:off x="0" y="0"/>
+                      <a:ext cx="5303520" cy="2983230"/>
+                    </a:xfrm>
+                    <a:prstGeom prst="rect"/>
+                  </pic:spPr>
+                </pic:pic>
+              </a:graphicData>
+            </a:graphic>
+          </wp:inline>
+        </w:drawing>
+      </w:r>
+    </w:p>
+    <w:p>
+      <w:pPr>
+        <w:jc w:val="center"/>
+      </w:pPr>
+      <w:r>
+        <w:rPr>
+          <w:i/>
+          <w:color w:val="787878"/>
+          <w:sz w:val="18"/>
+        </w:rPr>
+        <w:t>Figura: Dashboard Ejecutivo</w:t>
+      </w:r>
+    </w:p>
+    <w:p>
+      <w:pPr>
+        <w:pStyle w:val="Heading2"/>
+      </w:pPr>
+      <w:r>
+        <w:rPr>
+          <w:b/>
+          <w:color w:val="282828"/>
+          <w:sz w:val="26"/>
+        </w:rPr>
+        <w:t>9.9 Administración de Platillos</w:t>
+      </w:r>
+    </w:p>
+    <w:p>
+      <w:pPr>
+        <w:jc w:val="center"/>
+      </w:pPr>
+      <w:r>
+        <w:drawing>
+          <wp:inline xmlns:a="http://schemas.openxmlformats.org/drawingml/2006/main" xmlns:pic="http://schemas.openxmlformats.org/drawingml/2006/picture">
+            <wp:extent cx="5303520" cy="2983230"/>
+            <wp:docPr id="10" name="Picture 10"/>
+            <wp:cNvGraphicFramePr>
+              <a:graphicFrameLocks noChangeAspect="1"/>
+            </wp:cNvGraphicFramePr>
+            <a:graphic>
+              <a:graphicData uri="http://schemas.openxmlformats.org/drawingml/2006/picture">
+                <pic:pic>
+                  <pic:nvPicPr>
+                    <pic:cNvPr id="0" name="07_panel_administracion.png"/>
+                    <pic:cNvPicPr/>
+                  </pic:nvPicPr>
+                  <pic:blipFill>
+                    <a:blip r:embed="rId18"/>
+                    <a:stretch>
+                      <a:fillRect/>
+                    </a:stretch>
+                  </pic:blipFill>
+                  <pic:spPr>
+                    <a:xfrm>
+                      <a:off x="0" y="0"/>
+                      <a:ext cx="5303520" cy="2983230"/>
+                    </a:xfrm>
+                    <a:prstGeom prst="rect"/>
+                  </pic:spPr>
+                </pic:pic>
+              </a:graphicData>
+            </a:graphic>
+          </wp:inline>
+        </w:drawing>
+      </w:r>
+    </w:p>
+    <w:p>
+      <w:pPr>
+        <w:jc w:val="center"/>
+      </w:pPr>
+      <w:r>
+        <w:rPr>
+          <w:i/>
+          <w:color w:val="787878"/>
+          <w:sz w:val="18"/>
+        </w:rPr>
+        <w:t>Figura: Panel Admin Platillos</w:t>
+      </w:r>
+    </w:p>
+    <w:p>
+      <w:pPr>
+        <w:pStyle w:val="Heading1"/>
+      </w:pPr>
+      <w:r>
+        <w:rPr>
+          <w:b/>
+          <w:color w:val="D4AF37"/>
+          <w:sz w:val="32"/>
+        </w:rPr>
+        <w:t>10. Validaciones Importantes</w:t>
       </w:r>
     </w:p>
     <w:tbl>
@@ -90,42 +1630,42 @@
         <w:tc>
           <w:tcPr>
             <w:tcW w:type="dxa" w:w="3120"/>
-            <w:shd w:fill="D4AF37"/>
+            <w:shd w:fill="F4F4F4"/>
           </w:tcPr>
           <w:p>
             <w:r>
               <w:rPr>
                 <w:b/>
               </w:rPr>
-              <w:t>Rol</w:t>
+              <w:t>Campo / Módulo</w:t>
             </w:r>
           </w:p>
         </w:tc>
         <w:tc>
           <w:tcPr>
             <w:tcW w:type="dxa" w:w="3120"/>
-            <w:shd w:fill="D4AF37"/>
+            <w:shd w:fill="F4F4F4"/>
           </w:tcPr>
           <w:p>
             <w:r>
               <w:rPr>
                 <w:b/>
               </w:rPr>
-              <w:t>Vistas Disponibles</w:t>
+              <w:t>Regla de Negocio</w:t>
             </w:r>
           </w:p>
         </w:tc>
         <w:tc>
           <w:tcPr>
             <w:tcW w:type="dxa" w:w="3120"/>
-            <w:shd w:fill="D4AF37"/>
+            <w:shd w:fill="F4F4F4"/>
           </w:tcPr>
           <w:p>
             <w:r>
               <w:rPr>
                 <w:b/>
               </w:rPr>
-              <w:t>Descripción de Permisos</w:t>
+              <w:t>Ejemplo / Resultado</w:t>
             </w:r>
           </w:p>
         </w:tc>
@@ -137,7 +1677,7 @@
           </w:tcPr>
           <w:p>
             <w:r>
-              <w:t>Administrador</w:t>
+              <w:t>Mesa en Checkout</w:t>
             </w:r>
           </w:p>
         </w:tc>
@@ -147,7 +1687,7 @@
           </w:tcPr>
           <w:p>
             <w:r>
-              <w:t>Todas las pantallas</w:t>
+              <w:t>Obligatorio seleccionar una mesa antes de cobrar.</w:t>
             </w:r>
           </w:p>
         </w:tc>
@@ -157,7 +1697,7 @@
           </w:tcPr>
           <w:p>
             <w:r>
-              <w:t>Acceso completo a mesas, edición de mapa, catálogo de platillos, inventario, reportes y finanzas.</w:t>
+              <w:t>Si no se elige mesa, no se procesa el pago.</w:t>
             </w:r>
           </w:p>
         </w:tc>
@@ -169,7 +1709,7 @@
           </w:tcPr>
           <w:p>
             <w:r>
-              <w:t>Cajera</w:t>
+              <w:t>Cantidad en Carrito</w:t>
             </w:r>
           </w:p>
         </w:tc>
@@ -179,7 +1719,7 @@
           </w:tcPr>
           <w:p>
             <w:r>
-              <w:t>Mesas, Pedidos, Carrito, Inventario</w:t>
+              <w:t>No se permiten cantidades negativas o cero.</w:t>
             </w:r>
           </w:p>
         </w:tc>
@@ -189,7 +1729,7 @@
           </w:tcPr>
           <w:p>
             <w:r>
-              <w:t>Gestión de cobros, registro de gastos/abonos, seguimiento de comedores y visualización del stock.</w:t>
+              <w:t>El botón '-' elimina el ítem al llegar a 0.</w:t>
             </w:r>
           </w:p>
         </w:tc>
@@ -201,7 +1741,7 @@
           </w:tcPr>
           <w:p>
             <w:r>
-              <w:t>Mesero</w:t>
+              <w:t>Cálculo de IVA</w:t>
             </w:r>
           </w:p>
         </w:tc>
@@ -211,7 +1751,7 @@
           </w:tcPr>
           <w:p>
             <w:r>
-              <w:t>Mesas, Menú, Carrito</w:t>
+              <w:t>Aplica tasa fija del 16% sobre el subtotal neto.</w:t>
             </w:r>
           </w:p>
         </w:tc>
@@ -221,7 +1761,103 @@
           </w:tcPr>
           <w:p>
             <w:r>
-              <w:t>Consulta rápida de ocupación de mesas, toma de comanda y envío a cocina.</w:t>
+              <w:t>Subtotal = $100.00 → IVA = $16.00 → Total = $116.00.</w:t>
+            </w:r>
+          </w:p>
+        </w:tc>
+      </w:tr>
+      <w:tr>
+        <w:tc>
+          <w:tcPr>
+            <w:tcW w:type="dxa" w:w="3120"/>
+          </w:tcPr>
+          <w:p>
+            <w:r>
+              <w:t>Cupones</w:t>
+            </w:r>
+          </w:p>
+        </w:tc>
+        <w:tc>
+          <w:tcPr>
+            <w:tcW w:type="dxa" w:w="3120"/>
+          </w:tcPr>
+          <w:p>
+            <w:r>
+              <w:t>Se descuenta antes del cálculo de IVA.</w:t>
+            </w:r>
+          </w:p>
+        </w:tc>
+        <w:tc>
+          <w:tcPr>
+            <w:tcW w:type="dxa" w:w="3120"/>
+          </w:tcPr>
+          <w:p>
+            <w:r>
+              <w:t>Subtotal $200 - Cupón $20 = $180 netos + $28.80 IVA.</w:t>
+            </w:r>
+          </w:p>
+        </w:tc>
+      </w:tr>
+      <w:tr>
+        <w:tc>
+          <w:tcPr>
+            <w:tcW w:type="dxa" w:w="3120"/>
+          </w:tcPr>
+          <w:p>
+            <w:r>
+              <w:t>Nivel de Stock</w:t>
+            </w:r>
+          </w:p>
+        </w:tc>
+        <w:tc>
+          <w:tcPr>
+            <w:tcW w:type="dxa" w:w="3120"/>
+          </w:tcPr>
+          <w:p>
+            <w:r>
+              <w:t>Alerta roja automática al caer el stock.</w:t>
+            </w:r>
+          </w:p>
+        </w:tc>
+        <w:tc>
+          <w:tcPr>
+            <w:tcW w:type="dxa" w:w="3120"/>
+          </w:tcPr>
+          <w:p>
+            <w:r>
+              <w:t>Stock Actual (1.2 kg) &lt; Stock Mínimo (2.0 kg) → 'Bajo Stock'.</w:t>
+            </w:r>
+          </w:p>
+        </w:tc>
+      </w:tr>
+      <w:tr>
+        <w:tc>
+          <w:tcPr>
+            <w:tcW w:type="dxa" w:w="3120"/>
+          </w:tcPr>
+          <w:p>
+            <w:r>
+              <w:t>Acceso a Rutas</w:t>
+            </w:r>
+          </w:p>
+        </w:tc>
+        <w:tc>
+          <w:tcPr>
+            <w:tcW w:type="dxa" w:w="3120"/>
+          </w:tcPr>
+          <w:p>
+            <w:r>
+              <w:t>Restringido estrictamente por el rol asignado.</w:t>
+            </w:r>
+          </w:p>
+        </w:tc>
+        <w:tc>
+          <w:tcPr>
+            <w:tcW w:type="dxa" w:w="3120"/>
+          </w:tcPr>
+          <w:p>
+            <w:r>
+              <w:t>El rol Cocina solo accede a /cocina e /historial.</w:t>
             </w:r>
           </w:p>
         </w:tc>
@@ -236,108 +1872,22 @@
         <w:rPr>
           <w:b/>
           <w:color w:val="D4AF37"/>
-          <w:sz w:val="36"/>
+          <w:sz w:val="32"/>
         </w:rPr>
-        <w:t>3. Guía Paso a Paso de los Módulos</w:t>
-      </w:r>
-    </w:p>
-    <w:p>
-      <w:pPr>
-        <w:pStyle w:val="Heading2"/>
-      </w:pPr>
-      <w:r>
-        <w:rPr>
-          <w:b/>
-          <w:color w:val="282828"/>
-          <w:sz w:val="28"/>
-        </w:rPr>
-        <w:t>3.1 Plano Interactivo de Mesas</w:t>
+        <w:t>11. Atajos y Accesos Rápidos</w:t>
       </w:r>
     </w:p>
     <w:p>
       <w:r>
-        <w:t>Permite visualizar la distribución física del salón de comedor en tiempo real mediante colores:</w:t>
+        <w:t>• Campanita Notificaciones: Hacer clic en la campanita flotante del header.</w:t>
         <w:br/>
-        <w:t>• Verde (Libre): Mesa disponible para asignar nuevos comensales.</w:t>
+        <w:t>• Cambiar Tema Visual: Clic en el icono Sol/Luna en el encabezado.</w:t>
         <w:br/>
-        <w:t>• Rojo (Ocupado): Mesa con clientes consumiendo y tiempo transcurrido.</w:t>
+        <w:t>• Colapsar / Abrir Menú: Clic en el icono de Hamburguesa (≡) junto al logo.</w:t>
         <w:br/>
-        <w:t>• Naranja (Reservado): Mesa apartada para clientes futuros.</w:t>
+        <w:t>• Búsqueda de Platillos: Usar la barra de búsqueda en 'Tomar Pedido'.</w:t>
         <w:br/>
-        <w:br/>
-        <w:t>Modo Edición (Administrador): Permite arrastrar mesas con el mouse/touch en la cuadrícula de 900x450, cambiar la forma (rectangular/circular), modificar dimensiones o rotación. Las posiciones se guardan de forma permanente en la nube.</w:t>
-      </w:r>
-    </w:p>
-    <w:p>
-      <w:pPr>
-        <w:pStyle w:val="Heading2"/>
-      </w:pPr>
-      <w:r>
-        <w:rPr>
-          <w:b/>
-          <w:color w:val="282828"/>
-          <w:sz w:val="28"/>
-        </w:rPr>
-        <w:t>3.2 Menú Digital y Tomar Pedido</w:t>
-      </w:r>
-    </w:p>
-    <w:p>
-      <w:r>
-        <w:t>Organizado por categorías (Entradas, Platos Fuertes, Bebidas y Postres). Cuenta con un buscador en tiempo real para filtrar platillos por nombre y agregar ítems al pedido con el botón '+ AGREGAR'.</w:t>
-      </w:r>
-    </w:p>
-    <w:p>
-      <w:pPr>
-        <w:pStyle w:val="Heading2"/>
-      </w:pPr>
-      <w:r>
-        <w:rPr>
-          <w:b/>
-          <w:color w:val="282828"/>
-          <w:sz w:val="28"/>
-        </w:rPr>
-        <w:t>3.3 Carrito, Cobros e IVA (Checkout)</w:t>
-      </w:r>
-    </w:p>
-    <w:p>
-      <w:r>
-        <w:t>Módulo de liquidación de cuentas. Es obligatorio seleccionar la mesa activa (ej. Mesa A1) y el método de pago (Efectivo o Tarjeta). El sistema desglosa automáticamente el Subtotal, calcula el IVA del 16% (Subtotal * 0.16) y genera un Ticket Digital de compra con folio único.</w:t>
-      </w:r>
-    </w:p>
-    <w:p>
-      <w:pPr>
-        <w:pStyle w:val="Heading2"/>
-      </w:pPr>
-      <w:r>
-        <w:rPr>
-          <w:b/>
-          <w:color w:val="282828"/>
-          <w:sz w:val="28"/>
-        </w:rPr>
-        <w:t>3.4 Control de Inventario e Insumos</w:t>
-      </w:r>
-    </w:p>
-    <w:p>
-      <w:r>
-        <w:t>Control de ingredientes clave (Pulpo, Camarón, Pescado, Limón, Aceite) con sus unidades de medida (kg, L, g, unidades). Incluye alertas en color rojo ('Bajo Stock') cuando la cantidad cae por debajo del stock mínimo configurado.</w:t>
-      </w:r>
-    </w:p>
-    <w:p>
-      <w:pPr>
-        <w:pStyle w:val="Heading2"/>
-      </w:pPr>
-      <w:r>
-        <w:rPr>
-          <w:b/>
-          <w:color w:val="282828"/>
-          <w:sz w:val="28"/>
-        </w:rPr>
-        <w:t>3.5 Dashboard Ejecutivo y Métricas</w:t>
-      </w:r>
-    </w:p>
-    <w:p>
-      <w:r>
-        <w:t>Muestra los indicadores clave (KPIs): Ventas diarias ($), Comandas activas, Margen operativo (%) y Ocupación (%). Incluye gráficas interactivas por hora y ranking de los platillos más vendidos.</w:t>
+        <w:t>• Cerrar Sesión: Clic en el icono de salir en la esquina superior derecha.</w:t>
       </w:r>
     </w:p>
     <w:p>
@@ -348,20 +1898,320 @@
         <w:rPr>
           <w:b/>
           <w:color w:val="D4AF37"/>
-          <w:sz w:val="36"/>
+          <w:sz w:val="32"/>
         </w:rPr>
-        <w:t>4. Guía de Carga y Consulta en OneDrive</w:t>
+        <w:t>12. Solución de Problemas (Troubleshooting)</w:t>
+      </w:r>
+    </w:p>
+    <w:tbl>
+      <w:tblPr>
+        <w:tblStyle w:val="TableGrid"/>
+        <w:tblW w:type="auto" w:w="0"/>
+        <w:jc w:val="center"/>
+        <w:tblLook w:firstColumn="1" w:firstRow="1" w:lastColumn="0" w:lastRow="0" w:noHBand="0" w:noVBand="1" w:val="04A0"/>
+      </w:tblPr>
+      <w:tblGrid>
+        <w:gridCol w:w="3120"/>
+        <w:gridCol w:w="3120"/>
+        <w:gridCol w:w="3120"/>
+      </w:tblGrid>
+      <w:tr>
+        <w:tc>
+          <w:tcPr>
+            <w:tcW w:type="dxa" w:w="3120"/>
+            <w:shd w:fill="F4F4F4"/>
+          </w:tcPr>
+          <w:p>
+            <w:r>
+              <w:rPr>
+                <w:b/>
+              </w:rPr>
+              <w:t>Síntoma</w:t>
+            </w:r>
+          </w:p>
+        </w:tc>
+        <w:tc>
+          <w:tcPr>
+            <w:tcW w:type="dxa" w:w="3120"/>
+            <w:shd w:fill="F4F4F4"/>
+          </w:tcPr>
+          <w:p>
+            <w:r>
+              <w:rPr>
+                <w:b/>
+              </w:rPr>
+              <w:t>Causa Probable</w:t>
+            </w:r>
+          </w:p>
+        </w:tc>
+        <w:tc>
+          <w:tcPr>
+            <w:tcW w:type="dxa" w:w="3120"/>
+            <w:shd w:fill="F4F4F4"/>
+          </w:tcPr>
+          <w:p>
+            <w:r>
+              <w:rPr>
+                <w:b/>
+              </w:rPr>
+              <w:t>Solución Recomendada</w:t>
+            </w:r>
+          </w:p>
+        </w:tc>
+      </w:tr>
+      <w:tr>
+        <w:tc>
+          <w:tcPr>
+            <w:tcW w:type="dxa" w:w="3120"/>
+          </w:tcPr>
+          <w:p>
+            <w:r>
+              <w:t>No puedo iniciar sesión.</w:t>
+            </w:r>
+          </w:p>
+        </w:tc>
+        <w:tc>
+          <w:tcPr>
+            <w:tcW w:type="dxa" w:w="3120"/>
+          </w:tcPr>
+          <w:p>
+            <w:r>
+              <w:t>Credenciales mal escritas o usuario no registrado.</w:t>
+            </w:r>
+          </w:p>
+        </w:tc>
+        <w:tc>
+          <w:tcPr>
+            <w:tcW w:type="dxa" w:w="3120"/>
+          </w:tcPr>
+          <w:p>
+            <w:r>
+              <w:t>Verifica mayúsculas o solicita revisión al Administrador.</w:t>
+            </w:r>
+          </w:p>
+        </w:tc>
+      </w:tr>
+      <w:tr>
+        <w:tc>
+          <w:tcPr>
+            <w:tcW w:type="dxa" w:w="3120"/>
+          </w:tcPr>
+          <w:p>
+            <w:r>
+              <w:t>Las mesas no guardaron cambios.</w:t>
+            </w:r>
+          </w:p>
+        </w:tc>
+        <w:tc>
+          <w:tcPr>
+            <w:tcW w:type="dxa" w:w="3120"/>
+          </w:tcPr>
+          <w:p>
+            <w:r>
+              <w:t>No se presionó 'Salir de Edición'.</w:t>
+            </w:r>
+          </w:p>
+        </w:tc>
+        <w:tc>
+          <w:tcPr>
+            <w:tcW w:type="dxa" w:w="3120"/>
+          </w:tcPr>
+          <w:p>
+            <w:r>
+              <w:t>Presiona siempre 'Salir de Edición' para guardar en Supabase.</w:t>
+            </w:r>
+          </w:p>
+        </w:tc>
+      </w:tr>
+      <w:tr>
+        <w:tc>
+          <w:tcPr>
+            <w:tcW w:type="dxa" w:w="3120"/>
+          </w:tcPr>
+          <w:p>
+            <w:r>
+              <w:t>Los platillos no cargan.</w:t>
+            </w:r>
+          </w:p>
+        </w:tc>
+        <w:tc>
+          <w:tcPr>
+            <w:tcW w:type="dxa" w:w="3120"/>
+          </w:tcPr>
+          <w:p>
+            <w:r>
+              <w:t>Pérdida temporal de conexión a internet.</w:t>
+            </w:r>
+          </w:p>
+        </w:tc>
+        <w:tc>
+          <w:tcPr>
+            <w:tcW w:type="dxa" w:w="3120"/>
+          </w:tcPr>
+          <w:p>
+            <w:r>
+              <w:t>Revisa tu red y presiona F5 para recargar.</w:t>
+            </w:r>
+          </w:p>
+        </w:tc>
+      </w:tr>
+      <w:tr>
+        <w:tc>
+          <w:tcPr>
+            <w:tcW w:type="dxa" w:w="3120"/>
+          </w:tcPr>
+          <w:p>
+            <w:r>
+              <w:t>Me aparece 'Acceso Restringido'.</w:t>
+            </w:r>
+          </w:p>
+        </w:tc>
+        <w:tc>
+          <w:tcPr>
+            <w:tcW w:type="dxa" w:w="3120"/>
+          </w:tcPr>
+          <w:p>
+            <w:r>
+              <w:t>Intentaste entrar a una vista no permitida.</w:t>
+            </w:r>
+          </w:p>
+        </w:tc>
+        <w:tc>
+          <w:tcPr>
+            <w:tcW w:type="dxa" w:w="3120"/>
+          </w:tcPr>
+          <w:p>
+            <w:r>
+              <w:t>Inicia sesión con la cuenta del rol adecuado (ej. Admin).</w:t>
+            </w:r>
+          </w:p>
+        </w:tc>
+      </w:tr>
+    </w:tbl>
+    <w:p/>
+    <w:p>
+      <w:pPr>
+        <w:pStyle w:val="Heading1"/>
+      </w:pPr>
+      <w:r>
+        <w:rPr>
+          <w:b/>
+          <w:color w:val="D4AF37"/>
+          <w:sz w:val="32"/>
+        </w:rPr>
+        <w:t>13. Preguntas Frecuentes (FAQ)</w:t>
       </w:r>
     </w:p>
     <w:p>
       <w:r>
-        <w:t>Para compartir este manual institucionalmente en Microsoft OneDrive:</w:t>
+        <w:t>¿Cómo divido una cuenta entre varias personas?</w:t>
         <w:br/>
-        <w:t>1. Abre tu navegador e ingresa a https://onedrive.live.com o al OneDrive institucional.</w:t>
+        <w:t>En la pantalla de pago exitoso del Carrito, presiona 'Dividir Cuenta' y elige entre partes iguales, porcentaje o monto manual.</w:t>
         <w:br/>
-        <w:t>2. Arrastra este archivo 'MANUAL_DEL_USUARIO.docx' dentro de tu carpeta de OneDrive.</w:t>
         <w:br/>
-        <w:t>3. Haz clic derecho sobre el archivo en OneDrive, selecciona 'Compartir' -&gt; 'Cualquier persona con el enlace puede ver' -&gt; 'Copiar Enlace'.</w:t>
+        <w:t>¿Los platillos descuentan ingredientes automáticamente?</w:t>
+        <w:br/>
+        <w:t>Sí, al confirmar un pedido, el sistema descuenta las cantidades configuradas en la receta.</w:t>
+        <w:br/>
+        <w:br/>
+        <w:t>¿Puedo exportar reportes a Excel?</w:t>
+        <w:br/>
+        <w:t>Sí. En la sección de Reportes, haz clic en 'Exportar CSV'.</w:t>
+      </w:r>
+    </w:p>
+    <w:p>
+      <w:pPr>
+        <w:pStyle w:val="Heading1"/>
+      </w:pPr>
+      <w:r>
+        <w:rPr>
+          <w:b/>
+          <w:color w:val="D4AF37"/>
+          <w:sz w:val="32"/>
+        </w:rPr>
+        <w:t>14. Buenas Prácticas</w:t>
+      </w:r>
+    </w:p>
+    <w:p>
+      <w:r>
+        <w:t>1. 🔒 Cierra sesión al retirarte de tu turno.</w:t>
+        <w:br/>
+        <w:t>2. 💡 Revisa la campanita de notificaciones para atender alertas de stock.</w:t>
+        <w:br/>
+        <w:t>3. 👨‍🍳 Mantén actualizada la pantalla de Cocina pasando pedidos a 'Listo'.</w:t>
+        <w:br/>
+        <w:t>4. ⚠️ Verifica los cupones antes de aplicarlos en caja.</w:t>
+      </w:r>
+    </w:p>
+    <w:p>
+      <w:pPr>
+        <w:pStyle w:val="Heading1"/>
+      </w:pPr>
+      <w:r>
+        <w:rPr>
+          <w:b/>
+          <w:color w:val="D4AF37"/>
+          <w:sz w:val="32"/>
+        </w:rPr>
+        <w:t>15. Seguridad y Confidencialidad de Datos</w:t>
+      </w:r>
+    </w:p>
+    <w:p>
+      <w:r>
+        <w:t>La plataforma utiliza Supabase (PostgreSQL en la nube). Las contraseñas están cifradas con bcrypt y las tablas implementan políticas Row Level Security (RLS) por rol para proteger la información sensible.</w:t>
+      </w:r>
+    </w:p>
+    <w:p>
+      <w:pPr>
+        <w:pStyle w:val="Heading1"/>
+      </w:pPr>
+      <w:r>
+        <w:rPr>
+          <w:b/>
+          <w:color w:val="D4AF37"/>
+          <w:sz w:val="32"/>
+        </w:rPr>
+        <w:t>16. Canal de Soporte y Contacto</w:t>
+      </w:r>
+    </w:p>
+    <w:p>
+      <w:r>
+        <w:t>• Equipo de Soporte: Lopez Estrella B. O., Castro Nuñez N. M., Pech Ake S. A., May de los Santos J. J.</w:t>
+        <w:br/>
+        <w:t>• Correo de Contacto: soporte@elpulpazo.com</w:t>
+        <w:br/>
+        <w:t>• Horario de Atención: Lunes a Domingo de 8:00 AM a 10:00 PM.</w:t>
+      </w:r>
+    </w:p>
+    <w:p>
+      <w:pPr>
+        <w:pStyle w:val="Heading1"/>
+      </w:pPr>
+      <w:r>
+        <w:rPr>
+          <w:b/>
+          <w:color w:val="D4AF37"/>
+          <w:sz w:val="32"/>
+        </w:rPr>
+        <w:t>17. Glosario y Conclusiones</w:t>
+      </w:r>
+    </w:p>
+    <w:p>
+      <w:r>
+        <w:t>Glosario:</w:t>
+        <w:br/>
+        <w:t>• RBAC: Control de acceso basado en roles de usuario.</w:t>
+        <w:br/>
+        <w:t>• Kanban: Sistema visual de columnas (Pendiente, En preparación, Listo) para gestión de comandas.</w:t>
+        <w:br/>
+        <w:t>• Supabase: Backend as a Service con PostgreSQL en la nube.</w:t>
+        <w:br/>
+        <w:t>• CSV: Archivo de texto separado por comas compatible con Microsoft Excel.</w:t>
+        <w:br/>
+        <w:br/>
+        <w:t>Conclusión:</w:t>
+        <w:br/>
+        <w:t>El manual del usuario de El Pulpazo v3.1 garantiza que todo el personal operativo maneje la plataforma con fluidez, llevando un control impecable del salón, la cocina, las finanzas y el inventario.</w:t>
       </w:r>
     </w:p>
     <w:sectPr>
@@ -737,9 +2587,6 @@
     <w:name w:val="Normal"/>
     <w:qFormat/>
     <w:rsid w:val="00FC693F"/>
-    <w:rPr>
-      <w:sz w:val="22"/>
-    </w:rPr>
   </w:style>
   <w:style w:type="paragraph" w:styleId="Header">
     <w:name w:val="header"/>

</xml_diff>